<commit_message>
Update AquiferOpenBibleDictionary for 2026-07-17 release
</commit_message>
<xml_diff>
--- a/eng/docx/004.content.docx
+++ b/eng/docx/004.content.docx
@@ -27937,7 +27937,7 @@
         <w:rPr>
           <w:lang w:val="en_US" w:bidi="en_US"/>
         </w:rPr>
-        <w:t>The English word "demon" comes from the Greek word "</w:t>
+        <w:t xml:space="preserve">The English word "demon" comes from the Greek word </w:t>
       </w:r>
       <w:r>
         <w:rPr>
@@ -27950,7 +27950,7 @@
         <w:rPr>
           <w:lang w:val="en_US" w:bidi="en_US"/>
         </w:rPr>
-        <w:t xml:space="preserve">," which means "a divinity or deity" (for instance, a false god or demon; see </w:t>
+        <w:t xml:space="preserve">, which means "a divinity or deity" (for instance, a false god or demon; see </w:t>
       </w:r>
       <w:hyperlink r:id="rId722">
         <w:r>
@@ -27968,7 +27968,21 @@
         <w:rPr>
           <w:lang w:val="en_US" w:bidi="en_US"/>
         </w:rPr>
-        <w:t>). Any deity other than the one true God is considered an evil spirit or demon The word "demon" does not appear in the King James Version, which incorrectly translates "</w:t>
+        <w:t xml:space="preserve">). Any deity other than the one true God is considered an evil spirit or demon. </w:t>
+      </w:r>
+    </w:p>
+    <w:p>
+      <w:pPr/>
+      <w:r>
+        <w:rPr>
+          <w:lang w:val="en_US" w:bidi="en_US"/>
+        </w:rPr>
+      </w:r>
+      <w:r>
+        <w:rPr>
+          <w:lang w:val="en_US" w:bidi="en_US"/>
+        </w:rPr>
+        <w:t xml:space="preserve">The word "demon" does not appear in the King James Version, which incorrectly translates </w:t>
       </w:r>
       <w:r>
         <w:rPr>
@@ -27981,7 +27995,7 @@
         <w:rPr>
           <w:lang w:val="en_US" w:bidi="en_US"/>
         </w:rPr>
-        <w:t>" as "devil." There is only one devil (Greek "</w:t>
+        <w:t xml:space="preserve"> as "devil." There is only one devil (Greek </w:t>
       </w:r>
       <w:r>
         <w:rPr>
@@ -27994,141 +28008,21 @@
         <w:rPr>
           <w:lang w:val="en_US" w:bidi="en_US"/>
         </w:rPr>
-        <w:t>"). The Bible uses various names, titles, and descriptions to refer to the devil. He is the leader of all other demons, and they follow him.</w:t>
-      </w:r>
-    </w:p>
-    <w:p>
-      <w:pPr/>
-      <w:r>
-        <w:rPr>
-          <w:lang w:val="en_US" w:bidi="en_US"/>
-        </w:rPr>
-      </w:r>
-      <w:r>
-        <w:rPr>
-          <w:lang w:val="en_US" w:bidi="en_US"/>
-        </w:rPr>
-        <w:t>In the Bible, the word "spirit" often refers to a demon, along with a descriptive phrase. Examples include "evil spirits" (</w:t>
-      </w:r>
-      <w:hyperlink r:id="rId723">
-        <w:r>
-          <w:rPr>
-            <w:lang w:val="en_US" w:bidi="en_US"/>
-          </w:rPr>
-          <w:rPr>
-            <w:color w:val="0000EE"/>
-            <w:u w:val="single"/>
-          </w:rPr>
-          <w:t>Acts 19:12–13</w:t>
-        </w:r>
-      </w:hyperlink>
-      <w:r>
-        <w:rPr>
-          <w:lang w:val="en_US" w:bidi="en_US"/>
-        </w:rPr>
-        <w:t>), "unclean spirits" (</w:t>
-      </w:r>
-      <w:hyperlink r:id="rId724">
-        <w:r>
-          <w:rPr>
-            <w:lang w:val="en_US" w:bidi="en_US"/>
-          </w:rPr>
-          <w:rPr>
-            <w:color w:val="0000EE"/>
-            <w:u w:val="single"/>
-          </w:rPr>
-          <w:t>Matthew 10:1</w:t>
-        </w:r>
-      </w:hyperlink>
-      <w:r>
-        <w:rPr>
-          <w:lang w:val="en_US" w:bidi="en_US"/>
-        </w:rPr>
-        <w:t xml:space="preserve">; </w:t>
-      </w:r>
-      <w:hyperlink r:id="rId725">
-        <w:r>
-          <w:rPr>
-            <w:lang w:val="en_US" w:bidi="en_US"/>
-          </w:rPr>
-          <w:rPr>
-            <w:color w:val="0000EE"/>
-            <w:u w:val="single"/>
-          </w:rPr>
-          <w:t>Mark 1:23, 26</w:t>
-        </w:r>
-      </w:hyperlink>
-      <w:r>
-        <w:rPr>
-          <w:lang w:val="en_US" w:bidi="en_US"/>
-        </w:rPr>
-        <w:t xml:space="preserve">; </w:t>
-      </w:r>
-      <w:hyperlink r:id="rId726">
-        <w:r>
-          <w:rPr>
-            <w:lang w:val="en_US" w:bidi="en_US"/>
-          </w:rPr>
-          <w:rPr>
-            <w:color w:val="0000EE"/>
-            <w:u w:val="single"/>
-          </w:rPr>
-          <w:t>Acts 5:16</w:t>
-        </w:r>
-      </w:hyperlink>
-      <w:r>
-        <w:rPr>
-          <w:lang w:val="en_US" w:bidi="en_US"/>
-        </w:rPr>
-        <w:t>), "a spirit" (</w:t>
-      </w:r>
-      <w:hyperlink r:id="rId727">
-        <w:r>
-          <w:rPr>
-            <w:lang w:val="en_US" w:bidi="en_US"/>
-          </w:rPr>
-          <w:rPr>
-            <w:color w:val="0000EE"/>
-            <w:u w:val="single"/>
-          </w:rPr>
-          <w:t>Luke 13:11</w:t>
-        </w:r>
-      </w:hyperlink>
-      <w:r>
-        <w:rPr>
-          <w:lang w:val="en_US" w:bidi="en_US"/>
-        </w:rPr>
-        <w:t>), and "</w:t>
-      </w:r>
-      <w:r>
-        <w:rPr>
-          <w:lang w:val="en_US" w:bidi="en_US"/>
-        </w:rPr>
-        <w:t>deaf and mute spirit</w:t>
-      </w:r>
-      <w:r>
-        <w:rPr>
-          <w:lang w:val="en_US" w:bidi="en_US"/>
-        </w:rPr>
-        <w:t>" (</w:t>
-      </w:r>
-      <w:hyperlink r:id="rId504">
-        <w:r>
-          <w:rPr>
-            <w:lang w:val="en_US" w:bidi="en_US"/>
-          </w:rPr>
-          <w:rPr>
-            <w:color w:val="0000EE"/>
-            <w:u w:val="single"/>
-          </w:rPr>
-          <w:t>Mark 9:25</w:t>
-        </w:r>
-      </w:hyperlink>
-      <w:r>
-        <w:rPr>
-          <w:lang w:val="en_US" w:bidi="en_US"/>
-        </w:rPr>
-        <w:t xml:space="preserve">). Spirits can be identified by their role or function. For example: </w:t>
+        <w:t>). The Bible uses various names, titles, and descriptions to refer to the devil. He is the leader of all other demons, and they follow him.</w:t>
+      </w:r>
+    </w:p>
+    <w:p>
+      <w:pPr/>
+      <w:r>
+        <w:rPr>
+          <w:lang w:val="en_US" w:bidi="en_US"/>
+        </w:rPr>
+      </w:r>
+      <w:r>
+        <w:rPr>
+          <w:lang w:val="en_US" w:bidi="en_US"/>
+        </w:rPr>
+        <w:t>In the Bible, the word "spirit" often refers to a demon, along with a descriptive phrase. Examples include:</w:t>
       </w:r>
     </w:p>
     <w:p>
@@ -28146,7 +28040,25 @@
         <w:rPr>
           <w:lang w:val="en_US" w:bidi="en_US"/>
         </w:rPr>
-        <w:t>a spirit of murder</w:t>
+        <w:t>"evil spirits" (</w:t>
+      </w:r>
+      <w:hyperlink r:id="rId723">
+        <w:r>
+          <w:rPr>
+            <w:lang w:val="en_US" w:bidi="en_US"/>
+          </w:rPr>
+          <w:rPr>
+            <w:color w:val="0000EE"/>
+            <w:u w:val="single"/>
+          </w:rPr>
+          <w:t>Acts 19:12–13</w:t>
+        </w:r>
+      </w:hyperlink>
+      <w:r>
+        <w:rPr>
+          <w:lang w:val="en_US" w:bidi="en_US"/>
+        </w:rPr>
+        <w:t xml:space="preserve">), </w:t>
       </w:r>
     </w:p>
     <w:p>
@@ -28164,7 +28076,61 @@
         <w:rPr>
           <w:lang w:val="en_US" w:bidi="en_US"/>
         </w:rPr>
-        <w:t>a spirit of suicide</w:t>
+        <w:t>"unclean spirits" (</w:t>
+      </w:r>
+      <w:hyperlink r:id="rId724">
+        <w:r>
+          <w:rPr>
+            <w:lang w:val="en_US" w:bidi="en_US"/>
+          </w:rPr>
+          <w:rPr>
+            <w:color w:val="0000EE"/>
+            <w:u w:val="single"/>
+          </w:rPr>
+          <w:t>Matthew 10:1</w:t>
+        </w:r>
+      </w:hyperlink>
+      <w:r>
+        <w:rPr>
+          <w:lang w:val="en_US" w:bidi="en_US"/>
+        </w:rPr>
+        <w:t xml:space="preserve">; </w:t>
+      </w:r>
+      <w:hyperlink r:id="rId725">
+        <w:r>
+          <w:rPr>
+            <w:lang w:val="en_US" w:bidi="en_US"/>
+          </w:rPr>
+          <w:rPr>
+            <w:color w:val="0000EE"/>
+            <w:u w:val="single"/>
+          </w:rPr>
+          <w:t>Mark 1:23, 26</w:t>
+        </w:r>
+      </w:hyperlink>
+      <w:r>
+        <w:rPr>
+          <w:lang w:val="en_US" w:bidi="en_US"/>
+        </w:rPr>
+        <w:t xml:space="preserve">; </w:t>
+      </w:r>
+      <w:hyperlink r:id="rId726">
+        <w:r>
+          <w:rPr>
+            <w:lang w:val="en_US" w:bidi="en_US"/>
+          </w:rPr>
+          <w:rPr>
+            <w:color w:val="0000EE"/>
+            <w:u w:val="single"/>
+          </w:rPr>
+          <w:t>Acts 5:16</w:t>
+        </w:r>
+      </w:hyperlink>
+      <w:r>
+        <w:rPr>
+          <w:lang w:val="en_US" w:bidi="en_US"/>
+        </w:rPr>
+        <w:t xml:space="preserve">), </w:t>
       </w:r>
     </w:p>
     <w:p>
@@ -28182,7 +28148,25 @@
         <w:rPr>
           <w:lang w:val="en_US" w:bidi="en_US"/>
         </w:rPr>
-        <w:t>a spirit of lust</w:t>
+        <w:t>"a spirit" (</w:t>
+      </w:r>
+      <w:hyperlink r:id="rId727">
+        <w:r>
+          <w:rPr>
+            <w:lang w:val="en_US" w:bidi="en_US"/>
+          </w:rPr>
+          <w:rPr>
+            <w:color w:val="0000EE"/>
+            <w:u w:val="single"/>
+          </w:rPr>
+          <w:t>Luke 13:11</w:t>
+        </w:r>
+      </w:hyperlink>
+      <w:r>
+        <w:rPr>
+          <w:lang w:val="en_US" w:bidi="en_US"/>
+        </w:rPr>
+        <w:t xml:space="preserve">), and </w:t>
       </w:r>
     </w:p>
     <w:p>
@@ -28200,7 +28184,51 @@
         <w:rPr>
           <w:lang w:val="en_US" w:bidi="en_US"/>
         </w:rPr>
-        <w:t>a spirit of depression</w:t>
+        <w:t>"</w:t>
+      </w:r>
+      <w:r>
+        <w:rPr>
+          <w:lang w:val="en_US" w:bidi="en_US"/>
+        </w:rPr>
+        <w:t>deaf and mute spirit</w:t>
+      </w:r>
+      <w:r>
+        <w:rPr>
+          <w:lang w:val="en_US" w:bidi="en_US"/>
+        </w:rPr>
+        <w:t>" (</w:t>
+      </w:r>
+      <w:hyperlink r:id="rId504">
+        <w:r>
+          <w:rPr>
+            <w:lang w:val="en_US" w:bidi="en_US"/>
+          </w:rPr>
+          <w:rPr>
+            <w:color w:val="0000EE"/>
+            <w:u w:val="single"/>
+          </w:rPr>
+          <w:t>Mark 9:25</w:t>
+        </w:r>
+      </w:hyperlink>
+      <w:r>
+        <w:rPr>
+          <w:lang w:val="en_US" w:bidi="en_US"/>
+        </w:rPr>
+        <w:t xml:space="preserve">). </w:t>
+      </w:r>
+    </w:p>
+    <w:p>
+      <w:pPr/>
+      <w:r>
+        <w:rPr>
+          <w:lang w:val="en_US" w:bidi="en_US"/>
+        </w:rPr>
+      </w:r>
+      <w:r>
+        <w:rPr>
+          <w:lang w:val="en_US" w:bidi="en_US"/>
+        </w:rPr>
+        <w:t xml:space="preserve">Spirits can be identified by their role or function, such as: </w:t>
       </w:r>
     </w:p>
     <w:p>
@@ -28218,7 +28246,7 @@
         <w:rPr>
           <w:lang w:val="en_US" w:bidi="en_US"/>
         </w:rPr>
-        <w:t>a spirit of fear</w:t>
+        <w:t>a spirit of murder,</w:t>
       </w:r>
     </w:p>
     <w:p>
@@ -28236,107 +28264,7 @@
         <w:rPr>
           <w:lang w:val="en_US" w:bidi="en_US"/>
         </w:rPr>
-        <w:t>a spirit of lying</w:t>
-      </w:r>
-    </w:p>
-    <w:p>
-      <w:pPr/>
-      <w:r>
-        <w:rPr>
-          <w:lang w:val="en_US" w:bidi="en_US"/>
-        </w:rPr>
-      </w:r>
-      <w:r>
-        <w:rPr>
-          <w:lang w:val="en_US" w:bidi="en_US"/>
-        </w:rPr>
-        <w:t>These spirits are linked to various sins or attitudes that go against God.</w:t>
-      </w:r>
-    </w:p>
-    <w:p>
-      <w:pPr/>
-      <w:r>
-        <w:rPr>
-          <w:lang w:val="en_US" w:bidi="en_US"/>
-        </w:rPr>
-      </w:r>
-      <w:r>
-        <w:rPr>
-          <w:lang w:val="en_US" w:bidi="en_US"/>
-        </w:rPr>
-        <w:t>In the Hebrew Old Testament, there is no word for "demon." The term "spirit of distress" appears (</w:t>
-      </w:r>
-      <w:hyperlink r:id="rId728">
-        <w:r>
-          <w:rPr>
-            <w:lang w:val="en_US" w:bidi="en_US"/>
-          </w:rPr>
-          <w:rPr>
-            <w:color w:val="0000EE"/>
-            <w:u w:val="single"/>
-          </w:rPr>
-          <w:t>Judges 9:23</w:t>
-        </w:r>
-      </w:hyperlink>
-      <w:r>
-        <w:rPr>
-          <w:lang w:val="en_US" w:bidi="en_US"/>
-        </w:rPr>
-        <w:t xml:space="preserve">; </w:t>
-      </w:r>
-      <w:hyperlink r:id="rId729">
-        <w:r>
-          <w:rPr>
-            <w:lang w:val="en_US" w:bidi="en_US"/>
-          </w:rPr>
-          <w:rPr>
-            <w:color w:val="0000EE"/>
-            <w:u w:val="single"/>
-          </w:rPr>
-          <w:t>1 Samuel 16:14–23</w:t>
-        </w:r>
-      </w:hyperlink>
-      <w:r>
-        <w:rPr>
-          <w:lang w:val="en_US" w:bidi="en_US"/>
-        </w:rPr>
-        <w:t xml:space="preserve">; </w:t>
-      </w:r>
-      <w:hyperlink r:id="rId730">
-        <w:r>
-          <w:rPr>
-            <w:lang w:val="en_US" w:bidi="en_US"/>
-          </w:rPr>
-          <w:rPr>
-            <w:color w:val="0000EE"/>
-            <w:u w:val="single"/>
-          </w:rPr>
-          <w:t>18:10</w:t>
-        </w:r>
-      </w:hyperlink>
-      <w:r>
-        <w:rPr>
-          <w:lang w:val="en_US" w:bidi="en_US"/>
-        </w:rPr>
-        <w:t xml:space="preserve">; </w:t>
-      </w:r>
-      <w:hyperlink r:id="rId731">
-        <w:r>
-          <w:rPr>
-            <w:lang w:val="en_US" w:bidi="en_US"/>
-          </w:rPr>
-          <w:rPr>
-            <w:color w:val="0000EE"/>
-            <w:u w:val="single"/>
-          </w:rPr>
-          <w:t>19:9</w:t>
-        </w:r>
-      </w:hyperlink>
-      <w:r>
-        <w:rPr>
-          <w:lang w:val="en_US" w:bidi="en_US"/>
-        </w:rPr>
-        <w:t xml:space="preserve">). There are also mentions of: </w:t>
+        <w:t>a spirit of suicide,</w:t>
       </w:r>
     </w:p>
     <w:p>
@@ -28354,43 +28282,7 @@
         <w:rPr>
           <w:lang w:val="en_US" w:bidi="en_US"/>
         </w:rPr>
-        <w:t>"A lying spirit" (</w:t>
-      </w:r>
-      <w:hyperlink r:id="rId732">
-        <w:r>
-          <w:rPr>
-            <w:lang w:val="en_US" w:bidi="en_US"/>
-          </w:rPr>
-          <w:rPr>
-            <w:color w:val="0000EE"/>
-            <w:u w:val="single"/>
-          </w:rPr>
-          <w:t>1 Kings 22:22–23</w:t>
-        </w:r>
-      </w:hyperlink>
-      <w:r>
-        <w:rPr>
-          <w:lang w:val="en_US" w:bidi="en_US"/>
-        </w:rPr>
-        <w:t xml:space="preserve">; </w:t>
-      </w:r>
-      <w:hyperlink r:id="rId733">
-        <w:r>
-          <w:rPr>
-            <w:lang w:val="en_US" w:bidi="en_US"/>
-          </w:rPr>
-          <w:rPr>
-            <w:color w:val="0000EE"/>
-            <w:u w:val="single"/>
-          </w:rPr>
-          <w:t>2 Chronicles 18:20–22</w:t>
-        </w:r>
-      </w:hyperlink>
-      <w:r>
-        <w:rPr>
-          <w:lang w:val="en_US" w:bidi="en_US"/>
-        </w:rPr>
-        <w:t>)</w:t>
+        <w:t>a spirit of lust,</w:t>
       </w:r>
     </w:p>
     <w:p>
@@ -28408,43 +28300,7 @@
         <w:rPr>
           <w:lang w:val="en_US" w:bidi="en_US"/>
         </w:rPr>
-        <w:t>"A medium" (literally: familiar spirit) (</w:t>
-      </w:r>
-      <w:hyperlink r:id="rId734">
-        <w:r>
-          <w:rPr>
-            <w:lang w:val="en_US" w:bidi="en_US"/>
-          </w:rPr>
-          <w:rPr>
-            <w:color w:val="0000EE"/>
-            <w:u w:val="single"/>
-          </w:rPr>
-          <w:t>1 Chronicles 10:13</w:t>
-        </w:r>
-      </w:hyperlink>
-      <w:r>
-        <w:rPr>
-          <w:lang w:val="en_US" w:bidi="en_US"/>
-        </w:rPr>
-        <w:t xml:space="preserve">; </w:t>
-      </w:r>
-      <w:hyperlink r:id="rId735">
-        <w:r>
-          <w:rPr>
-            <w:lang w:val="en_US" w:bidi="en_US"/>
-          </w:rPr>
-          <w:rPr>
-            <w:color w:val="0000EE"/>
-            <w:u w:val="single"/>
-          </w:rPr>
-          <w:t>2 Chronicles 33:6</w:t>
-        </w:r>
-      </w:hyperlink>
-      <w:r>
-        <w:rPr>
-          <w:lang w:val="en_US" w:bidi="en_US"/>
-        </w:rPr>
-        <w:t>)</w:t>
+        <w:t>a spirit of depression,</w:t>
       </w:r>
     </w:p>
     <w:p>
@@ -28462,25 +28318,7 @@
         <w:rPr>
           <w:lang w:val="en_US" w:bidi="en_US"/>
         </w:rPr>
-        <w:t>"A spirit of confusion" (</w:t>
-      </w:r>
-      <w:hyperlink r:id="rId736">
-        <w:r>
-          <w:rPr>
-            <w:lang w:val="en_US" w:bidi="en_US"/>
-          </w:rPr>
-          <w:rPr>
-            <w:color w:val="0000EE"/>
-            <w:u w:val="single"/>
-          </w:rPr>
-          <w:t>Isaiah 19:14</w:t>
-        </w:r>
-      </w:hyperlink>
-      <w:r>
-        <w:rPr>
-          <w:lang w:val="en_US" w:bidi="en_US"/>
-        </w:rPr>
-        <w:t>)</w:t>
+        <w:t>a spirit of fear, or</w:t>
       </w:r>
     </w:p>
     <w:p>
@@ -28498,25 +28336,107 @@
         <w:rPr>
           <w:lang w:val="en_US" w:bidi="en_US"/>
         </w:rPr>
-        <w:t>"A spirit of deep sleep" (</w:t>
-      </w:r>
-      <w:hyperlink r:id="rId737">
-        <w:r>
-          <w:rPr>
-            <w:lang w:val="en_US" w:bidi="en_US"/>
-          </w:rPr>
-          <w:rPr>
-            <w:color w:val="0000EE"/>
-            <w:u w:val="single"/>
-          </w:rPr>
-          <w:t>Isaiah 29:10</w:t>
-        </w:r>
-      </w:hyperlink>
-      <w:r>
-        <w:rPr>
-          <w:lang w:val="en_US" w:bidi="en_US"/>
-        </w:rPr>
-        <w:t>)</w:t>
+        <w:t>a spirit of lying.</w:t>
+      </w:r>
+    </w:p>
+    <w:p>
+      <w:pPr/>
+      <w:r>
+        <w:rPr>
+          <w:lang w:val="en_US" w:bidi="en_US"/>
+        </w:rPr>
+      </w:r>
+      <w:r>
+        <w:rPr>
+          <w:lang w:val="en_US" w:bidi="en_US"/>
+        </w:rPr>
+        <w:t>These spirits are linked to various sins or attitudes that go against God.</w:t>
+      </w:r>
+    </w:p>
+    <w:p>
+      <w:pPr/>
+      <w:r>
+        <w:rPr>
+          <w:lang w:val="en_US" w:bidi="en_US"/>
+        </w:rPr>
+      </w:r>
+      <w:r>
+        <w:rPr>
+          <w:lang w:val="en_US" w:bidi="en_US"/>
+        </w:rPr>
+        <w:t>In the Hebrew Old Testament, there is no word for "demon." The term "spirit of distress" appears (</w:t>
+      </w:r>
+      <w:hyperlink r:id="rId728">
+        <w:r>
+          <w:rPr>
+            <w:lang w:val="en_US" w:bidi="en_US"/>
+          </w:rPr>
+          <w:rPr>
+            <w:color w:val="0000EE"/>
+            <w:u w:val="single"/>
+          </w:rPr>
+          <w:t>Judges 9:23</w:t>
+        </w:r>
+      </w:hyperlink>
+      <w:r>
+        <w:rPr>
+          <w:lang w:val="en_US" w:bidi="en_US"/>
+        </w:rPr>
+        <w:t xml:space="preserve">; </w:t>
+      </w:r>
+      <w:hyperlink r:id="rId729">
+        <w:r>
+          <w:rPr>
+            <w:lang w:val="en_US" w:bidi="en_US"/>
+          </w:rPr>
+          <w:rPr>
+            <w:color w:val="0000EE"/>
+            <w:u w:val="single"/>
+          </w:rPr>
+          <w:t>1 Samuel 16:14–23</w:t>
+        </w:r>
+      </w:hyperlink>
+      <w:r>
+        <w:rPr>
+          <w:lang w:val="en_US" w:bidi="en_US"/>
+        </w:rPr>
+        <w:t xml:space="preserve">; </w:t>
+      </w:r>
+      <w:hyperlink r:id="rId730">
+        <w:r>
+          <w:rPr>
+            <w:lang w:val="en_US" w:bidi="en_US"/>
+          </w:rPr>
+          <w:rPr>
+            <w:color w:val="0000EE"/>
+            <w:u w:val="single"/>
+          </w:rPr>
+          <w:t>18:10</w:t>
+        </w:r>
+      </w:hyperlink>
+      <w:r>
+        <w:rPr>
+          <w:lang w:val="en_US" w:bidi="en_US"/>
+        </w:rPr>
+        <w:t xml:space="preserve">; </w:t>
+      </w:r>
+      <w:hyperlink r:id="rId731">
+        <w:r>
+          <w:rPr>
+            <w:lang w:val="en_US" w:bidi="en_US"/>
+          </w:rPr>
+          <w:rPr>
+            <w:color w:val="0000EE"/>
+            <w:u w:val="single"/>
+          </w:rPr>
+          <w:t>19:9</w:t>
+        </w:r>
+      </w:hyperlink>
+      <w:r>
+        <w:rPr>
+          <w:lang w:val="en_US" w:bidi="en_US"/>
+        </w:rPr>
+        <w:t xml:space="preserve">). There are also mentions of: </w:t>
       </w:r>
     </w:p>
     <w:p>
@@ -28534,18 +28454,18 @@
         <w:rPr>
           <w:lang w:val="en_US" w:bidi="en_US"/>
         </w:rPr>
-        <w:t>"A spirit of prostitution" (</w:t>
-      </w:r>
-      <w:hyperlink r:id="rId738">
-        <w:r>
-          <w:rPr>
-            <w:lang w:val="en_US" w:bidi="en_US"/>
-          </w:rPr>
-          <w:rPr>
-            <w:color w:val="0000EE"/>
-            <w:u w:val="single"/>
-          </w:rPr>
-          <w:t>Hosea 4:12</w:t>
+        <w:t>"a lying spirit" (</w:t>
+      </w:r>
+      <w:hyperlink r:id="rId732">
+        <w:r>
+          <w:rPr>
+            <w:lang w:val="en_US" w:bidi="en_US"/>
+          </w:rPr>
+          <w:rPr>
+            <w:color w:val="0000EE"/>
+            <w:u w:val="single"/>
+          </w:rPr>
+          <w:t>1 Kings 22:22–23</w:t>
         </w:r>
       </w:hyperlink>
       <w:r>
@@ -28554,117 +28474,23 @@
         </w:rPr>
         <w:t xml:space="preserve">; </w:t>
       </w:r>
-      <w:hyperlink r:id="rId739">
-        <w:r>
-          <w:rPr>
-            <w:lang w:val="en_US" w:bidi="en_US"/>
-          </w:rPr>
-          <w:rPr>
-            <w:color w:val="0000EE"/>
-            <w:u w:val="single"/>
-          </w:rPr>
-          <w:t>5:4</w:t>
-        </w:r>
-      </w:hyperlink>
-      <w:r>
-        <w:rPr>
-          <w:lang w:val="en_US" w:bidi="en_US"/>
-        </w:rPr>
-        <w:t>)</w:t>
-      </w:r>
-    </w:p>
-    <w:p>
-      <w:pPr/>
-      <w:r>
-        <w:rPr>
-          <w:lang w:val="en_US" w:bidi="en_US"/>
-        </w:rPr>
-      </w:r>
-      <w:r>
-        <w:rPr>
-          <w:lang w:val="en_US" w:bidi="en_US"/>
-        </w:rPr>
-        <w:t>A powerful demon in the Old Testament is called "</w:t>
-      </w:r>
-      <w:r>
-        <w:rPr>
-          <w:lang w:val="en_US" w:bidi="en_US"/>
-        </w:rPr>
-        <w:t>the prince of the kingdom of Persia.</w:t>
-      </w:r>
-      <w:r>
-        <w:rPr>
-          <w:lang w:val="en_US" w:bidi="en_US"/>
-        </w:rPr>
-        <w:t>" This demon stopped the archangel Gabriel from delivering a message to Daniel. As a result, the archangel Michael helped Gabriel (</w:t>
-      </w:r>
-      <w:hyperlink r:id="rId740">
-        <w:r>
-          <w:rPr>
-            <w:lang w:val="en_US" w:bidi="en_US"/>
-          </w:rPr>
-          <w:rPr>
-            <w:color w:val="0000EE"/>
-            <w:u w:val="single"/>
-          </w:rPr>
-          <w:t>Daniel 10:13</w:t>
-        </w:r>
-      </w:hyperlink>
-      <w:r>
-        <w:rPr>
-          <w:lang w:val="en_US" w:bidi="en_US"/>
-        </w:rPr>
-        <w:t>).</w:t>
-      </w:r>
-    </w:p>
-    <w:p>
-      <w:pPr/>
-      <w:r>
-        <w:rPr>
-          <w:lang w:val="en_US" w:bidi="en_US"/>
-        </w:rPr>
-      </w:r>
-      <w:r>
-        <w:rPr>
-          <w:lang w:val="en_US" w:bidi="en_US"/>
-        </w:rPr>
-        <w:t xml:space="preserve">The number of demons is unknown, but it seems to be very large, possibly beyond counting. </w:t>
-      </w:r>
-      <w:hyperlink r:id="rId741">
-        <w:r>
-          <w:rPr>
-            <w:lang w:val="en_US" w:bidi="en_US"/>
-          </w:rPr>
-          <w:rPr>
-            <w:color w:val="0000EE"/>
-            <w:u w:val="single"/>
-          </w:rPr>
-          <w:t>Revelation 12:4</w:t>
-        </w:r>
-      </w:hyperlink>
-      <w:r>
-        <w:rPr>
-          <w:lang w:val="en_US" w:bidi="en_US"/>
-        </w:rPr>
-        <w:t xml:space="preserve"> suggests that Satan led one-third of the angels astray. This means the heavenly hosts outnumber Satan's forces two to one. </w:t>
-      </w:r>
-      <w:hyperlink r:id="rId742">
-        <w:r>
-          <w:rPr>
-            <w:lang w:val="en_US" w:bidi="en_US"/>
-          </w:rPr>
-          <w:rPr>
-            <w:color w:val="0000EE"/>
-            <w:u w:val="single"/>
-          </w:rPr>
-          <w:t>Ephesians 6:12</w:t>
-        </w:r>
-      </w:hyperlink>
-      <w:r>
-        <w:rPr>
-          <w:lang w:val="en_US" w:bidi="en_US"/>
-        </w:rPr>
-        <w:t xml:space="preserve"> describes levels of authority or ranks of demons: </w:t>
+      <w:hyperlink r:id="rId733">
+        <w:r>
+          <w:rPr>
+            <w:lang w:val="en_US" w:bidi="en_US"/>
+          </w:rPr>
+          <w:rPr>
+            <w:color w:val="0000EE"/>
+            <w:u w:val="single"/>
+          </w:rPr>
+          <w:t>2 Chronicles 18:20–22</w:t>
+        </w:r>
+      </w:hyperlink>
+      <w:r>
+        <w:rPr>
+          <w:lang w:val="en_US" w:bidi="en_US"/>
+        </w:rPr>
+        <w:t>),</w:t>
       </w:r>
     </w:p>
     <w:p>
@@ -28682,7 +28508,56 @@
         <w:rPr>
           <w:lang w:val="en_US" w:bidi="en_US"/>
         </w:rPr>
-        <w:t xml:space="preserve">"The rulers" </w:t>
+        <w:t>"a medium" (</w:t>
+      </w:r>
+      <w:r>
+        <w:rPr>
+          <w:i/>
+          <w:lang w:val="en_US" w:bidi="en_US"/>
+        </w:rPr>
+        <w:t>literally</w:t>
+      </w:r>
+      <w:r>
+        <w:rPr>
+          <w:lang w:val="en_US" w:bidi="en_US"/>
+        </w:rPr>
+        <w:t xml:space="preserve"> "a familiar spirit"; </w:t>
+      </w:r>
+      <w:hyperlink r:id="rId734">
+        <w:r>
+          <w:rPr>
+            <w:lang w:val="en_US" w:bidi="en_US"/>
+          </w:rPr>
+          <w:rPr>
+            <w:color w:val="0000EE"/>
+            <w:u w:val="single"/>
+          </w:rPr>
+          <w:t>1 Chronicles 10:13</w:t>
+        </w:r>
+      </w:hyperlink>
+      <w:r>
+        <w:rPr>
+          <w:lang w:val="en_US" w:bidi="en_US"/>
+        </w:rPr>
+        <w:t xml:space="preserve">; </w:t>
+      </w:r>
+      <w:hyperlink r:id="rId735">
+        <w:r>
+          <w:rPr>
+            <w:lang w:val="en_US" w:bidi="en_US"/>
+          </w:rPr>
+          <w:rPr>
+            <w:color w:val="0000EE"/>
+            <w:u w:val="single"/>
+          </w:rPr>
+          <w:t>2 Chronicles 33:6</w:t>
+        </w:r>
+      </w:hyperlink>
+      <w:r>
+        <w:rPr>
+          <w:lang w:val="en_US" w:bidi="en_US"/>
+        </w:rPr>
+        <w:t>),</w:t>
       </w:r>
     </w:p>
     <w:p>
@@ -28700,7 +28575,25 @@
         <w:rPr>
           <w:lang w:val="en_US" w:bidi="en_US"/>
         </w:rPr>
-        <w:t xml:space="preserve">"The authorities" </w:t>
+        <w:t>"a spirit of confusion" (</w:t>
+      </w:r>
+      <w:hyperlink r:id="rId736">
+        <w:r>
+          <w:rPr>
+            <w:lang w:val="en_US" w:bidi="en_US"/>
+          </w:rPr>
+          <w:rPr>
+            <w:color w:val="0000EE"/>
+            <w:u w:val="single"/>
+          </w:rPr>
+          <w:t>Isaiah 19:14</w:t>
+        </w:r>
+      </w:hyperlink>
+      <w:r>
+        <w:rPr>
+          <w:lang w:val="en_US" w:bidi="en_US"/>
+        </w:rPr>
+        <w:t>),</w:t>
       </w:r>
     </w:p>
     <w:p>
@@ -28718,13 +28611,25 @@
         <w:rPr>
           <w:lang w:val="en_US" w:bidi="en_US"/>
         </w:rPr>
-        <w:t>"</w:t>
-      </w:r>
-      <w:r>
-        <w:rPr>
-          <w:lang w:val="en_US" w:bidi="en_US"/>
-        </w:rPr>
-        <w:t>The powers of this world’s darkness"</w:t>
+        <w:t>"a spirit of deep sleep" (</w:t>
+      </w:r>
+      <w:hyperlink r:id="rId737">
+        <w:r>
+          <w:rPr>
+            <w:lang w:val="en_US" w:bidi="en_US"/>
+          </w:rPr>
+          <w:rPr>
+            <w:color w:val="0000EE"/>
+            <w:u w:val="single"/>
+          </w:rPr>
+          <w:t>Isaiah 29:10</w:t>
+        </w:r>
+      </w:hyperlink>
+      <w:r>
+        <w:rPr>
+          <w:lang w:val="en_US" w:bidi="en_US"/>
+        </w:rPr>
+        <w:t>), and</w:t>
       </w:r>
     </w:p>
     <w:p>
@@ -28742,13 +28647,221 @@
         <w:rPr>
           <w:lang w:val="en_US" w:bidi="en_US"/>
         </w:rPr>
+        <w:t>"a spirit of prostitution" (</w:t>
+      </w:r>
+      <w:hyperlink r:id="rId738">
+        <w:r>
+          <w:rPr>
+            <w:lang w:val="en_US" w:bidi="en_US"/>
+          </w:rPr>
+          <w:rPr>
+            <w:color w:val="0000EE"/>
+            <w:u w:val="single"/>
+          </w:rPr>
+          <w:t>Hosea 4:12</w:t>
+        </w:r>
+      </w:hyperlink>
+      <w:r>
+        <w:rPr>
+          <w:lang w:val="en_US" w:bidi="en_US"/>
+        </w:rPr>
+        <w:t xml:space="preserve">; </w:t>
+      </w:r>
+      <w:hyperlink r:id="rId739">
+        <w:r>
+          <w:rPr>
+            <w:lang w:val="en_US" w:bidi="en_US"/>
+          </w:rPr>
+          <w:rPr>
+            <w:color w:val="0000EE"/>
+            <w:u w:val="single"/>
+          </w:rPr>
+          <w:t>5:4</w:t>
+        </w:r>
+      </w:hyperlink>
+      <w:r>
+        <w:rPr>
+          <w:lang w:val="en_US" w:bidi="en_US"/>
+        </w:rPr>
+        <w:t>).</w:t>
+      </w:r>
+    </w:p>
+    <w:p>
+      <w:pPr/>
+      <w:r>
+        <w:rPr>
+          <w:lang w:val="en_US" w:bidi="en_US"/>
+        </w:rPr>
+      </w:r>
+      <w:r>
+        <w:rPr>
+          <w:lang w:val="en_US" w:bidi="en_US"/>
+        </w:rPr>
+        <w:t>A powerful demon in the Old Testament is called "</w:t>
+      </w:r>
+      <w:r>
+        <w:rPr>
+          <w:lang w:val="en_US" w:bidi="en_US"/>
+        </w:rPr>
+        <w:t>the prince of the kingdom of Persia.</w:t>
+      </w:r>
+      <w:r>
+        <w:rPr>
+          <w:lang w:val="en_US" w:bidi="en_US"/>
+        </w:rPr>
+        <w:t>" This demon stopped the archangel Gabriel from delivering a message to Daniel. As a result, the archangel Michael helped Gabriel (</w:t>
+      </w:r>
+      <w:hyperlink r:id="rId740">
+        <w:r>
+          <w:rPr>
+            <w:lang w:val="en_US" w:bidi="en_US"/>
+          </w:rPr>
+          <w:rPr>
+            <w:color w:val="0000EE"/>
+            <w:u w:val="single"/>
+          </w:rPr>
+          <w:t>Daniel 10:13</w:t>
+        </w:r>
+      </w:hyperlink>
+      <w:r>
+        <w:rPr>
+          <w:lang w:val="en_US" w:bidi="en_US"/>
+        </w:rPr>
+        <w:t>).</w:t>
+      </w:r>
+    </w:p>
+    <w:p>
+      <w:pPr/>
+      <w:r>
+        <w:rPr>
+          <w:lang w:val="en_US" w:bidi="en_US"/>
+        </w:rPr>
+      </w:r>
+      <w:r>
+        <w:rPr>
+          <w:lang w:val="en_US" w:bidi="en_US"/>
+        </w:rPr>
+        <w:t xml:space="preserve">The number of demons is unknown, but it seems to be very large, possibly beyond counting. </w:t>
+      </w:r>
+      <w:hyperlink r:id="rId741">
+        <w:r>
+          <w:rPr>
+            <w:lang w:val="en_US" w:bidi="en_US"/>
+          </w:rPr>
+          <w:rPr>
+            <w:color w:val="0000EE"/>
+            <w:u w:val="single"/>
+          </w:rPr>
+          <w:t>Revelation 12:4</w:t>
+        </w:r>
+      </w:hyperlink>
+      <w:r>
+        <w:rPr>
+          <w:lang w:val="en_US" w:bidi="en_US"/>
+        </w:rPr>
+        <w:t xml:space="preserve"> suggests that Satan led one-third of the angels astray. This means the heavenly hosts outnumber Satan's forces two to one. </w:t>
+      </w:r>
+      <w:hyperlink r:id="rId742">
+        <w:r>
+          <w:rPr>
+            <w:lang w:val="en_US" w:bidi="en_US"/>
+          </w:rPr>
+          <w:rPr>
+            <w:color w:val="0000EE"/>
+            <w:u w:val="single"/>
+          </w:rPr>
+          <w:t>Ephesians 6:12</w:t>
+        </w:r>
+      </w:hyperlink>
+      <w:r>
+        <w:rPr>
+          <w:lang w:val="en_US" w:bidi="en_US"/>
+        </w:rPr>
+        <w:t xml:space="preserve"> suggests an order or rank of demons: </w:t>
+      </w:r>
+    </w:p>
+    <w:p>
+      <w:pPr>
+        <w:pStyle w:val="ListBullet"/>
+        <w:spacing w:line="240" w:lineRule="auto"/>
+        <w:ind w:left="720"/>
+      </w:pPr>
+      <w:r>
+        <w:rPr>
+          <w:lang w:val="en_US" w:bidi="en_US"/>
+        </w:rPr>
+      </w:r>
+      <w:r>
+        <w:rPr>
+          <w:lang w:val="en_US" w:bidi="en_US"/>
+        </w:rPr>
+        <w:t xml:space="preserve">"the rulers," </w:t>
+      </w:r>
+    </w:p>
+    <w:p>
+      <w:pPr>
+        <w:pStyle w:val="ListBullet"/>
+        <w:spacing w:line="240" w:lineRule="auto"/>
+        <w:ind w:left="720"/>
+      </w:pPr>
+      <w:r>
+        <w:rPr>
+          <w:lang w:val="en_US" w:bidi="en_US"/>
+        </w:rPr>
+      </w:r>
+      <w:r>
+        <w:rPr>
+          <w:lang w:val="en_US" w:bidi="en_US"/>
+        </w:rPr>
+        <w:t xml:space="preserve">"the authorities," </w:t>
+      </w:r>
+    </w:p>
+    <w:p>
+      <w:pPr>
+        <w:pStyle w:val="ListBullet"/>
+        <w:spacing w:line="240" w:lineRule="auto"/>
+        <w:ind w:left="720"/>
+      </w:pPr>
+      <w:r>
+        <w:rPr>
+          <w:lang w:val="en_US" w:bidi="en_US"/>
+        </w:rPr>
+      </w:r>
+      <w:r>
+        <w:rPr>
+          <w:lang w:val="en_US" w:bidi="en_US"/>
+        </w:rPr>
         <w:t>"</w:t>
       </w:r>
       <w:r>
         <w:rPr>
           <w:lang w:val="en_US" w:bidi="en_US"/>
         </w:rPr>
-        <w:t>The spiritual forces of evil in the heavenly realms"</w:t>
+        <w:t>the powers of this world’s darkness," and</w:t>
+      </w:r>
+    </w:p>
+    <w:p>
+      <w:pPr>
+        <w:pStyle w:val="ListBullet"/>
+        <w:spacing w:line="240" w:lineRule="auto"/>
+        <w:ind w:left="720"/>
+      </w:pPr>
+      <w:r>
+        <w:rPr>
+          <w:lang w:val="en_US" w:bidi="en_US"/>
+        </w:rPr>
+      </w:r>
+      <w:r>
+        <w:rPr>
+          <w:lang w:val="en_US" w:bidi="en_US"/>
+        </w:rPr>
+        <w:t>"</w:t>
+      </w:r>
+      <w:r>
+        <w:rPr>
+          <w:lang w:val="en_US" w:bidi="en_US"/>
+        </w:rPr>
+        <w:t>the spiritual forces of evil in the heavenly realms."</w:t>
       </w:r>
     </w:p>
     <w:p>
@@ -28817,7 +28930,21 @@
         <w:rPr>
           <w:lang w:val="en_US" w:bidi="en_US"/>
         </w:rPr>
-        <w:t>). Fallen angels have a similar role but serve a different master. They serve the devil because they are deceived and afraid. They want to work with humans, but their goal is to carry out Satan's plans and oppose God. They tempt, deceive, and mislead people to lead them to eternal punishment. In opposing God, they attack, oppress, hinder, and accuse God's people.</w:t>
+        <w:t xml:space="preserve">). </w:t>
+      </w:r>
+    </w:p>
+    <w:p>
+      <w:pPr/>
+      <w:r>
+        <w:rPr>
+          <w:lang w:val="en_US" w:bidi="en_US"/>
+        </w:rPr>
+      </w:r>
+      <w:r>
+        <w:rPr>
+          <w:lang w:val="en_US" w:bidi="en_US"/>
+        </w:rPr>
+        <w:t>Fallen angels have a similar role but serve a different master. They serve the devil because they are deceived and afraid. They want to work with humans, but their goal is to carry out Satan's plans and oppose God. They tempt, deceive, and mislead people to lead them to eternal punishment. In opposing God, they attack, oppress, hinder, and accuse God's people.</w:t>
       </w:r>
     </w:p>
     <w:p>
@@ -28975,7 +29102,7 @@
         <w:rPr>
           <w:lang w:val="en_US" w:bidi="en_US"/>
         </w:rPr>
-        <w:t>They deny God's word and challenge its statements.</w:t>
+        <w:t>they deny God's word and challenge its statements;</w:t>
       </w:r>
     </w:p>
     <w:p>
@@ -28993,7 +29120,7 @@
         <w:rPr>
           <w:lang w:val="en_US" w:bidi="en_US"/>
         </w:rPr>
-        <w:t>They deny the reality of death, often suggesting ideas like reincarnation.</w:t>
+        <w:t>they deny the reality of death, often suggesting ideas like reincarnation; and</w:t>
       </w:r>
     </w:p>
     <w:p>
@@ -29011,7 +29138,7 @@
         <w:rPr>
           <w:lang w:val="en_US" w:bidi="en_US"/>
         </w:rPr>
-        <w:t>They appeal to human vanity and pride by telling people they can become like God or be gods (</w:t>
+        <w:t>they appeal to human vanity and pride by telling people they can become like God or be gods (</w:t>
       </w:r>
       <w:hyperlink r:id="rId750">
         <w:r>

</xml_diff>